<commit_message>
Add style-aware hybrid engine, hybrid ranking, hybrid population runtime, and MusicXML export workflow
Made-with: Cursor
</commit_message>
<xml_diff>
--- a/engines/hybrid_engine/docs/User_Guide.docx
+++ b/engines/hybrid_engine/docs/User_Guide.docx
@@ -261,7 +261,52 @@
         <w:pStyle w:val="Heading1"/>
       </w:pPr>
       <w:r>
-        <w:t>Appendix: 20 Hybrid Composition Ideas</w:t>
+        <w:t>Style-Aware Hybrid Population Search</w:t>
+      </w:r>
+    </w:p>
+    <w:p>
+      <w:r>
+        <w:t>Generate many hybrids, score with evaluator + Style DNA, rank and export best:</w:t>
+      </w:r>
+    </w:p>
+    <w:p>
+      <w:pPr/>
+      <w:r>
+        <w:t>from hybrid_engine.hybrid_population_runtime import run_hybrid_population_search, export_top_hybrids</w:t>
+        <w:br/>
+        <w:br/>
+        <w:br/>
+        <w:br/>
+        <w:t>top = run_hybrid_population_search(</w:t>
+        <w:br/>
+        <w:br/>
+        <w:t xml:space="preserve">    input_text="My Hybrid",</w:t>
+        <w:br/>
+        <w:br/>
+        <w:t xml:space="preserve">    count=12,</w:t>
+        <w:br/>
+        <w:br/>
+        <w:t xml:space="preserve">    generations=2,</w:t>
+        <w:br/>
+        <w:br/>
+        <w:t xml:space="preserve">    top_n=5,</w:t>
+        <w:br/>
+        <w:br/>
+        <w:t xml:space="preserve">    seed=0,</w:t>
+        <w:br/>
+        <w:br/>
+        <w:t>)</w:t>
+        <w:br/>
+        <w:br/>
+        <w:t>export_top_hybrids(top, output_dir="output")</w:t>
+      </w:r>
+    </w:p>
+    <w:p>
+      <w:pPr>
+        <w:pStyle w:val="Heading1"/>
+      </w:pPr>
+      <w:r>
+        <w:t>Appendix: 20 Useful Hybrid Combinations</w:t>
       </w:r>
     </w:p>
     <w:p>
@@ -271,97 +316,97 @@
     </w:p>
     <w:p>
       <w:r>
-        <w:t>2. Hill melody + Monk rhythm</w:t>
+        <w:t>2. Hill melody + Monk rhythm + Shorter harmony</w:t>
       </w:r>
     </w:p>
     <w:p>
       <w:r>
-        <w:t>3. Monk melody + Shorter harmony</w:t>
+        <w:t>3. Monk melody + Barry Harris harmony + Hill counterline</w:t>
       </w:r>
     </w:p>
     <w:p>
       <w:r>
-        <w:t>4. Barry Harris melody + Hill harmony</w:t>
+        <w:t>4. Shorter melody + Monk harmony</w:t>
       </w:r>
     </w:p>
     <w:p>
       <w:r>
-        <w:t>5. Shorter melody + Monk harmony</w:t>
+        <w:t>5. Barry Harris melody + Hill harmony</w:t>
       </w:r>
     </w:p>
     <w:p>
       <w:r>
-        <w:t>6. Hill melody + Barry Harris harmony</w:t>
+        <w:t>6. Monk melody + Shorter harmony</w:t>
       </w:r>
     </w:p>
     <w:p>
       <w:r>
-        <w:t>7. Monk melody + Hill harmony</w:t>
+        <w:t>7. Hill melody + Barry Harris harmony</w:t>
       </w:r>
     </w:p>
     <w:p>
       <w:r>
-        <w:t>8. Barry Harris melody + Shorter harmony</w:t>
+        <w:t>8. Shorter melody + Harris + Monk rhythm</w:t>
       </w:r>
     </w:p>
     <w:p>
       <w:r>
-        <w:t>9. Shorter + Harris (melody + harmony)</w:t>
+        <w:t>9. Harris melody + Shorter harmony</w:t>
       </w:r>
     </w:p>
     <w:p>
       <w:r>
-        <w:t>10. Hill + Monk (angular + rhythmic)</w:t>
+        <w:t>10. Hill melody + Monk harmony</w:t>
       </w:r>
     </w:p>
     <w:p>
       <w:r>
-        <w:t>11. Monk + Shorter (blues + ambiguous)</w:t>
+        <w:t>11. Monk melody + Hill harmony</w:t>
       </w:r>
     </w:p>
     <w:p>
       <w:r>
-        <w:t>12. Harris + Hill (bebop + cluster)</w:t>
+        <w:t>12. Shorter melody + Hill harmony</w:t>
       </w:r>
     </w:p>
     <w:p>
       <w:r>
-        <w:t>13. Extract motifs from Shorter, inject into Monk</w:t>
+        <w:t>13. Harris melody + Monk harmony</w:t>
       </w:r>
     </w:p>
     <w:p>
       <w:r>
-        <w:t>14. Extract harmony from Harris, translate for Hill</w:t>
+        <w:t>14. Hill melody + Shorter harmony</w:t>
       </w:r>
     </w:p>
     <w:p>
       <w:r>
-        <w:t>15. Hill countermelody over Shorter melody</w:t>
+        <w:t>15. Monk melody + Harris harmony</w:t>
       </w:r>
     </w:p>
     <w:p>
       <w:r>
-        <w:t>16. Monk rhythm over Barry Harris melody</w:t>
+        <w:t>16. Shorter + Harris (melody + harmony)</w:t>
       </w:r>
     </w:p>
     <w:p>
       <w:r>
-        <w:t>17. Shorter + Harris + Monk (three-engine)</w:t>
+        <w:t>17. Hill + Monk (angular + rhythmic)</w:t>
       </w:r>
     </w:p>
     <w:p>
       <w:r>
-        <w:t>18. Hill melody, Harris harmony, Monk rhythm</w:t>
+        <w:t>18. Monk + Shorter (blues + ambiguous)</w:t>
       </w:r>
     </w:p>
     <w:p>
       <w:r>
-        <w:t>19. Cross-engine motif development</w:t>
+        <w:t>19. Harris + Hill (bebop + cluster)</w:t>
       </w:r>
     </w:p>
     <w:p>
       <w:r>
-        <w:t>20. Harmony from one engine, melody from another</w:t>
+        <w:t>20. Shorter + Harris + Monk (three-engine)</w:t>
       </w:r>
     </w:p>
     <w:sectPr>

</xml_diff>

<commit_message>
Frisell + Counterpoint Hybrid: verification complete
- Frisell Atmosphere Engine: full stack (composer_ir, interval_language, harmonic_fields, motif_development, form_planner, generator, section_compiler, musicxml_exporter)
- Counterpoint hybrid: counterpoint_planner, voice_assignment, counterpoint_generator, hybrid_voice_types; multi-voice compile/export
- Registry: frisell_atmosphere added
- Style DNA: bartok_night, wheeler_lyric, frisell_atmosphere in build_all_style_profiles
- Wayne Shorter: composer_ir loaded via importlib to avoid cross-engine import collisions
- Tests: 71 frisell+hybrid, 18 style_dna; all pass
- Verification: Frisell, 2-voice hybrid (Wheeler+Frisell+Bartok), 3-voice hybrid (Shorter+Harris+Hill+Monk); MusicXML valid

Made-with: Cursor
</commit_message>
<xml_diff>
--- a/engines/hybrid_engine/docs/User_Guide.docx
+++ b/engines/hybrid_engine/docs/User_Guide.docx
@@ -15,12 +15,25 @@
         <w:pStyle w:val="Heading1"/>
       </w:pPr>
       <w:r>
+        <w:t>Counterpoint-Capable Hybrid Layer</w:t>
+      </w:r>
+    </w:p>
+    <w:p>
+      <w:r>
+        <w:t>The hybrid engine supports **2–4 voice counterpoint**: lead, counterline, optional inner voice, optional bass motion. Use `counter_engine` to add a counterline; the compiler builds polyphonic texture and the MusicXML exporter outputs separate parts.</w:t>
+      </w:r>
+    </w:p>
+    <w:p>
+      <w:pPr>
+        <w:pStyle w:val="Heading1"/>
+      </w:pPr>
+      <w:r>
         <w:t>How Composer Engines Interact</w:t>
       </w:r>
     </w:p>
     <w:p>
       <w:r>
-        <w:t>The creative-engines project has four composer engines. Each engine exposes the same interface:</w:t>
+        <w:t>The creative-engines project has seven composer engines. Each engine exposes the same interface:</w:t>
       </w:r>
     </w:p>
     <w:p>
@@ -306,6 +319,52 @@
         <w:pStyle w:val="Heading1"/>
       </w:pPr>
       <w:r>
+        <w:t>2–4 Voice Use Cases</w:t>
+      </w:r>
+    </w:p>
+    <w:p>
+      <w:r>
+        <w:t>**2 voices**: Lead + counterline (e.g. Wheeler melody + Frisell counterline)</w:t>
+      </w:r>
+    </w:p>
+    <w:p>
+      <w:r>
+        <w:t>**3 voices**: Lead + counterline + inner (e.g. Shorter + Bartok counter + Harris harmony)</w:t>
+      </w:r>
+    </w:p>
+    <w:p>
+      <w:r>
+        <w:t>**4 voices**: Lead + counterline + inner + bass (e.g. Monk + Hill + Harris + Barry)</w:t>
+      </w:r>
+    </w:p>
+    <w:p>
+      <w:pPr>
+        <w:pStyle w:val="Heading1"/>
+      </w:pPr>
+      <w:r>
+        <w:t>Suggested Counterpoint Combinations</w:t>
+      </w:r>
+    </w:p>
+    <w:p>
+      <w:r>
+        <w:t>Wheeler melody + Frisell harmony + Bartok counterline</w:t>
+      </w:r>
+    </w:p>
+    <w:p>
+      <w:r>
+        <w:t>Shorter melody + Barry Harris harmony + Monk rhythm + Hill counterline</w:t>
+      </w:r>
+    </w:p>
+    <w:p>
+      <w:r>
+        <w:t>Frisell melody + Wheeler counterline + Bartok texture</w:t>
+      </w:r>
+    </w:p>
+    <w:p>
+      <w:pPr>
+        <w:pStyle w:val="Heading1"/>
+      </w:pPr>
+      <w:r>
         <w:t>Appendix: 20 Useful Hybrid Combinations</w:t>
       </w:r>
     </w:p>
@@ -331,7 +390,7 @@
     </w:p>
     <w:p>
       <w:r>
-        <w:t>5. Barry Harris melody + Hill harmony</w:t>
+        <w:t>5. Wheeler melody + Frisell harmony + Bartok counterline</w:t>
       </w:r>
     </w:p>
     <w:p>
@@ -351,7 +410,7 @@
     </w:p>
     <w:p>
       <w:r>
-        <w:t>9. Harris melody + Shorter harmony</w:t>
+        <w:t>9. Frisell melody + Wheeler counterline</w:t>
       </w:r>
     </w:p>
     <w:p>
@@ -376,7 +435,7 @@
     </w:p>
     <w:p>
       <w:r>
-        <w:t>14. Hill melody + Shorter harmony</w:t>
+        <w:t>14. Wheeler melody + Frisell atmosphere</w:t>
       </w:r>
     </w:p>
     <w:p>
@@ -396,7 +455,7 @@
     </w:p>
     <w:p>
       <w:r>
-        <w:t>18. Monk + Shorter (blues + ambiguous)</w:t>
+        <w:t>18. Bartok + Frisell (night + ambient)</w:t>
       </w:r>
     </w:p>
     <w:p>
@@ -407,6 +466,114 @@
     <w:p>
       <w:r>
         <w:t>20. Shorter + Harris + Monk (three-engine)</w:t>
+      </w:r>
+    </w:p>
+    <w:p>
+      <w:pPr>
+        <w:pStyle w:val="Heading1"/>
+      </w:pPr>
+      <w:r>
+        <w:t>Appendix: 20 Useful Counterpoint Hybrid Combinations</w:t>
+      </w:r>
+    </w:p>
+    <w:p>
+      <w:r>
+        <w:t>1. Wheeler melody + Frisell harmony + Bartok counterline</w:t>
+      </w:r>
+    </w:p>
+    <w:p>
+      <w:r>
+        <w:t>2. Shorter melody + Barry Harris harmony + Monk rhythm + Hill counterline</w:t>
+      </w:r>
+    </w:p>
+    <w:p>
+      <w:r>
+        <w:t>3. Frisell melody + Wheeler counterline + Bartok texture</w:t>
+      </w:r>
+    </w:p>
+    <w:p>
+      <w:r>
+        <w:t>4. Monk melody + Barry Harris harmony + Hill counterline</w:t>
+      </w:r>
+    </w:p>
+    <w:p>
+      <w:r>
+        <w:t>5. Wheeler melody + Frisell counterline</w:t>
+      </w:r>
+    </w:p>
+    <w:p>
+      <w:r>
+        <w:t>6. Bartok melody + Frisell harmony + Wheeler counterline</w:t>
+      </w:r>
+    </w:p>
+    <w:p>
+      <w:r>
+        <w:t>7. Shorter melody + Monk harmony + Bartok counterline</w:t>
+      </w:r>
+    </w:p>
+    <w:p>
+      <w:r>
+        <w:t>8. Hill melody + Frisell harmony + Wheeler counterline</w:t>
+      </w:r>
+    </w:p>
+    <w:p>
+      <w:r>
+        <w:t>9. Frisell melody + Bartok counterline</w:t>
+      </w:r>
+    </w:p>
+    <w:p>
+      <w:r>
+        <w:t>10. Wheeler melody + Shorter harmony + Frisell counterline</w:t>
+      </w:r>
+    </w:p>
+    <w:p>
+      <w:r>
+        <w:t>11. Monk melody + Wheeler harmony + Bartok counterline</w:t>
+      </w:r>
+    </w:p>
+    <w:p>
+      <w:r>
+        <w:t>12. Bartok melody + Wheeler counterline</w:t>
+      </w:r>
+    </w:p>
+    <w:p>
+      <w:r>
+        <w:t>13. Shorter melody + Frisell harmony + Wheeler counterline</w:t>
+      </w:r>
+    </w:p>
+    <w:p>
+      <w:r>
+        <w:t>14. Hill melody + Bartok counterline</w:t>
+      </w:r>
+    </w:p>
+    <w:p>
+      <w:r>
+        <w:t>15. Barry Harris melody + Wheeler harmony + Monk counterline</w:t>
+      </w:r>
+    </w:p>
+    <w:p>
+      <w:r>
+        <w:t>16. Wheeler + Frisell (lyrical + ambient)</w:t>
+      </w:r>
+    </w:p>
+    <w:p>
+      <w:r>
+        <w:t>17. Bartok + Wheeler (night + lyrical)</w:t>
+      </w:r>
+    </w:p>
+    <w:p>
+      <w:r>
+        <w:t>18. Frisell + Bartok (ambient + fragmented)</w:t>
+      </w:r>
+    </w:p>
+    <w:p>
+      <w:r>
+        <w:t>19. Shorter + Frisell (angular + open)</w:t>
+      </w:r>
+    </w:p>
+    <w:p>
+      <w:r>
+        <w:t>20. Monk + Wheeler + Bartok (three-engine counterpoint)</w:t>
       </w:r>
     </w:p>
     <w:sectPr>

</xml_diff>